<commit_message>
docs: populate student names, roll numbers, roles, certificate, and presentation metadata
</commit_message>
<xml_diff>
--- a/ML-Project Documentation_Updated.docx
+++ b/ML-Project Documentation_Updated.docx
@@ -66,9 +66,9 @@
           <w:rFonts w:ascii="Times New Roman" w:hAnsi="Times New Roman"/>
           <w:b/>
           <w:color w:val="003366"/>
-          <w:sz w:val="32"/>
+          <w:sz w:val="36"/>
         </w:rPr>
-        <w:t>“ TITLE OF THE COURSE END PROJECT ”</w:t>
+        <w:t>EMAIL SPAM DETECTION</w:t>
       </w:r>
     </w:p>
     <w:p>
@@ -94,11 +94,9 @@
         <w:rPr>
           <w:rFonts w:ascii="Times New Roman" w:hAnsi="Times New Roman"/>
           <w:b/>
-          <w:bCs/>
-          <w:sz w:val="26"/>
-          <w:szCs w:val="26"/>
+          <w:sz w:val="24"/>
         </w:rPr>
-        <w:t xml:space="preserve">Course Code  –Course Name </w:t>
+        <w:t>Course: Machine Learning (CSE - AI &amp; ML)</w:t>
       </w:r>
     </w:p>
     <w:p>
@@ -275,13 +273,13 @@
           <w:p>
             <w:pPr>
               <w:spacing w:before="40" w:after="40"/>
-            </w:pPr>
-            <w:r/>
-            <w:r>
-              <w:rPr>
-                <w:rFonts w:ascii="Times New Roman" w:hAnsi="Times New Roman"/>
-                <w:b w:val="0"/>
-                <w:i w:val="0"/>
+              <w:jc w:val="center"/>
+            </w:pPr>
+            <w:r/>
+            <w:r>
+              <w:rPr>
+                <w:rFonts w:ascii="Times New Roman" w:hAnsi="Times New Roman"/>
+                <w:b w:val="0"/>
                 <w:sz w:val="19"/>
               </w:rPr>
               <w:t>1</w:t>
@@ -296,16 +294,16 @@
           <w:p>
             <w:pPr>
               <w:spacing w:before="40" w:after="40"/>
-            </w:pPr>
-            <w:r/>
-            <w:r>
-              <w:rPr>
-                <w:rFonts w:ascii="Times New Roman" w:hAnsi="Times New Roman"/>
-                <w:b w:val="0"/>
-                <w:i w:val="0"/>
-                <w:sz w:val="19"/>
-              </w:rPr>
-              <w:t>[Roll Number]</w:t>
+              <w:jc w:val="center"/>
+            </w:pPr>
+            <w:r/>
+            <w:r>
+              <w:rPr>
+                <w:rFonts w:ascii="Times New Roman" w:hAnsi="Times New Roman"/>
+                <w:b/>
+                <w:sz w:val="19"/>
+              </w:rPr>
+              <w:t>24VE1A6681</w:t>
             </w:r>
           </w:p>
         </w:tc>
@@ -317,13 +315,13 @@
           <w:p>
             <w:pPr>
               <w:spacing w:before="40" w:after="40"/>
+              <w:jc w:val="left"/>
             </w:pPr>
             <w:r/>
             <w:r>
               <w:rPr>
                 <w:rFonts w:ascii="Times New Roman" w:hAnsi="Times New Roman"/>
                 <w:b/>
-                <w:i w:val="0"/>
                 <w:sz w:val="19"/>
               </w:rPr>
               <w:t>GANTA BALA AMOGH RAJ</w:t>
@@ -338,16 +336,16 @@
           <w:p>
             <w:pPr>
               <w:spacing w:before="40" w:after="40"/>
-            </w:pPr>
-            <w:r/>
-            <w:r>
-              <w:rPr>
-                <w:rFonts w:ascii="Times New Roman" w:hAnsi="Times New Roman"/>
-                <w:b w:val="0"/>
-                <w:i w:val="0"/>
-                <w:sz w:val="19"/>
-              </w:rPr>
-              <w:t>Team Lead &amp; ML Engineer</w:t>
+              <w:jc w:val="left"/>
+            </w:pPr>
+            <w:r/>
+            <w:r>
+              <w:rPr>
+                <w:rFonts w:ascii="Times New Roman" w:hAnsi="Times New Roman"/>
+                <w:b w:val="0"/>
+                <w:sz w:val="19"/>
+              </w:rPr>
+              <w:t>Team Lead &amp; ML Architect</w:t>
             </w:r>
           </w:p>
         </w:tc>
@@ -365,12 +363,15 @@
           </w:tcPr>
           <w:p>
             <w:pPr>
-              <w:spacing w:after="40" w:line="264" w:lineRule="auto"/>
-              <w:jc w:val="center"/>
-            </w:pPr>
-            <w:r>
-              <w:rPr>
-                <w:rFonts w:ascii="Times New Roman" w:hAnsi="Times New Roman"/>
+              <w:spacing w:before="40" w:after="40"/>
+              <w:jc w:val="center"/>
+            </w:pPr>
+            <w:r/>
+            <w:r>
+              <w:rPr>
+                <w:rFonts w:ascii="Times New Roman" w:hAnsi="Times New Roman"/>
+                <w:b w:val="0"/>
+                <w:sz w:val="19"/>
               </w:rPr>
               <w:t>2</w:t>
             </w:r>
@@ -383,8 +384,18 @@
           </w:tcPr>
           <w:p>
             <w:pPr>
-              <w:spacing w:after="40" w:line="264" w:lineRule="auto"/>
-            </w:pPr>
+              <w:spacing w:before="40" w:after="40"/>
+              <w:jc w:val="center"/>
+            </w:pPr>
+            <w:r/>
+            <w:r>
+              <w:rPr>
+                <w:rFonts w:ascii="Times New Roman" w:hAnsi="Times New Roman"/>
+                <w:b/>
+                <w:sz w:val="19"/>
+              </w:rPr>
+              <w:t>24VE1A6677</w:t>
+            </w:r>
           </w:p>
         </w:tc>
         <w:tc>
@@ -394,8 +405,18 @@
           </w:tcPr>
           <w:p>
             <w:pPr>
-              <w:spacing w:after="40" w:line="264" w:lineRule="auto"/>
-            </w:pPr>
+              <w:spacing w:before="40" w:after="40"/>
+              <w:jc w:val="left"/>
+            </w:pPr>
+            <w:r/>
+            <w:r>
+              <w:rPr>
+                <w:rFonts w:ascii="Times New Roman" w:hAnsi="Times New Roman"/>
+                <w:b/>
+                <w:sz w:val="19"/>
+              </w:rPr>
+              <w:t>DOMA AJAY</w:t>
+            </w:r>
           </w:p>
         </w:tc>
         <w:tc>
@@ -405,8 +426,18 @@
           </w:tcPr>
           <w:p>
             <w:pPr>
-              <w:spacing w:after="40" w:line="264" w:lineRule="auto"/>
-            </w:pPr>
+              <w:spacing w:before="40" w:after="40"/>
+              <w:jc w:val="left"/>
+            </w:pPr>
+            <w:r/>
+            <w:r>
+              <w:rPr>
+                <w:rFonts w:ascii="Times New Roman" w:hAnsi="Times New Roman"/>
+                <w:b w:val="0"/>
+                <w:sz w:val="19"/>
+              </w:rPr>
+              <w:t>Team Member &amp; Data/Preprocessing Analyst</w:t>
+            </w:r>
           </w:p>
         </w:tc>
       </w:tr>
@@ -422,16 +453,7 @@
             <w:vAlign w:val="center"/>
           </w:tcPr>
           <w:p>
-            <w:pPr>
-              <w:spacing w:after="40" w:line="264" w:lineRule="auto"/>
-              <w:jc w:val="center"/>
-            </w:pPr>
-            <w:r>
-              <w:rPr>
-                <w:rFonts w:ascii="Times New Roman" w:hAnsi="Times New Roman"/>
-              </w:rPr>
-              <w:t>3</w:t>
-            </w:r>
+            <w:r/>
           </w:p>
         </w:tc>
         <w:tc>
@@ -440,9 +462,7 @@
             <w:vAlign w:val="center"/>
           </w:tcPr>
           <w:p>
-            <w:pPr>
-              <w:spacing w:after="40" w:line="264" w:lineRule="auto"/>
-            </w:pPr>
+            <w:r/>
           </w:p>
         </w:tc>
         <w:tc>
@@ -451,9 +471,7 @@
             <w:vAlign w:val="center"/>
           </w:tcPr>
           <w:p>
-            <w:pPr>
-              <w:spacing w:after="40" w:line="264" w:lineRule="auto"/>
-            </w:pPr>
+            <w:r/>
           </w:p>
         </w:tc>
         <w:tc>
@@ -462,9 +480,7 @@
             <w:vAlign w:val="center"/>
           </w:tcPr>
           <w:p>
-            <w:pPr>
-              <w:spacing w:after="40" w:line="264" w:lineRule="auto"/>
-            </w:pPr>
+            <w:r/>
           </w:p>
         </w:tc>
       </w:tr>
@@ -480,16 +496,7 @@
             <w:vAlign w:val="center"/>
           </w:tcPr>
           <w:p>
-            <w:pPr>
-              <w:spacing w:after="40" w:line="264" w:lineRule="auto"/>
-              <w:jc w:val="center"/>
-            </w:pPr>
-            <w:r>
-              <w:rPr>
-                <w:rFonts w:ascii="Times New Roman" w:hAnsi="Times New Roman"/>
-              </w:rPr>
-              <w:t>4</w:t>
-            </w:r>
+            <w:r/>
           </w:p>
         </w:tc>
         <w:tc>
@@ -498,9 +505,7 @@
             <w:vAlign w:val="center"/>
           </w:tcPr>
           <w:p>
-            <w:pPr>
-              <w:spacing w:after="40" w:line="264" w:lineRule="auto"/>
-            </w:pPr>
+            <w:r/>
           </w:p>
         </w:tc>
         <w:tc>
@@ -509,9 +514,7 @@
             <w:vAlign w:val="center"/>
           </w:tcPr>
           <w:p>
-            <w:pPr>
-              <w:spacing w:after="40" w:line="264" w:lineRule="auto"/>
-            </w:pPr>
+            <w:r/>
           </w:p>
         </w:tc>
         <w:tc>
@@ -520,9 +523,7 @@
             <w:vAlign w:val="center"/>
           </w:tcPr>
           <w:p>
-            <w:pPr>
-              <w:spacing w:after="40" w:line="264" w:lineRule="auto"/>
-            </w:pPr>
+            <w:r/>
           </w:p>
         </w:tc>
       </w:tr>
@@ -624,45 +625,8 @@
         <w:rPr>
           <w:rFonts w:ascii="Times New Roman" w:hAnsi="Times New Roman"/>
           <w:sz w:val="24"/>
-          <w:szCs w:val="24"/>
         </w:rPr>
-        <w:t xml:space="preserve">This is to certify that the micro project entitled </w:t>
-      </w:r>
-      <w:r>
-        <w:rPr>
-          <w:rFonts w:ascii="Times New Roman" w:hAnsi="Times New Roman"/>
-          <w:b/>
-          <w:bCs/>
-          <w:sz w:val="24"/>
-          <w:szCs w:val="24"/>
-        </w:rPr>
-        <w:t>“____________________________”</w:t>
-      </w:r>
-      <w:r>
-        <w:rPr>
-          <w:rFonts w:ascii="Times New Roman" w:hAnsi="Times New Roman"/>
-          <w:sz w:val="24"/>
-          <w:szCs w:val="24"/>
-        </w:rPr>
-        <w:t xml:space="preserve"> is a bonafide work carried out by the students listed below of B.Tech ___ Year ___ Semester, Department of CSE (Artificial Intelligence &amp; Machine Learning), Sreyas Institute of Engineering and Technology, in partial fulfilment of the requirements of the course </w:t>
-      </w:r>
-      <w:r>
-        <w:rPr>
-          <w:rFonts w:ascii="Times New Roman" w:hAnsi="Times New Roman"/>
-          <w:b/>
-          <w:bCs/>
-          <w:sz w:val="24"/>
-          <w:szCs w:val="24"/>
-        </w:rPr>
-        <w:t>________________ (Course Code: ________)</w:t>
-      </w:r>
-      <w:r>
-        <w:rPr>
-          <w:rFonts w:ascii="Times New Roman" w:hAnsi="Times New Roman"/>
-          <w:sz w:val="24"/>
-          <w:szCs w:val="24"/>
-        </w:rPr>
-        <w:t xml:space="preserve"> during the academic year 20___–20___. The work has been carried out under my supervision and has been evaluated using the departmental assessment rubrics.</w:t>
+        <w:t>This is to certify that the micro project entitled 'EMAIL SPAM DETECTION' is a bonafide work carried out by GANTA BALA AMOGH RAJ (Roll No: 24VE1A6681) and DOMA AJAY (Roll No: 24VE1A6677), students of B.Tech, Department of CSE (Artificial Intelligence &amp; Machine Learning), Sreyas Institute of Engineering and Technology, in partial fulfilment of the requirements of the course Machine Learning during the academic year 2025–2026. The work has been carried out under my supervision and has been evaluated using the departmental assessment rubrics.</w:t>
       </w:r>
     </w:p>
     <w:tbl>
@@ -773,13 +737,13 @@
           <w:p>
             <w:pPr>
               <w:spacing w:before="40" w:after="40"/>
-            </w:pPr>
-            <w:r/>
-            <w:r>
-              <w:rPr>
-                <w:rFonts w:ascii="Times New Roman" w:hAnsi="Times New Roman"/>
-                <w:b w:val="0"/>
-                <w:i w:val="0"/>
+              <w:jc w:val="center"/>
+            </w:pPr>
+            <w:r/>
+            <w:r>
+              <w:rPr>
+                <w:rFonts w:ascii="Times New Roman" w:hAnsi="Times New Roman"/>
+                <w:b w:val="0"/>
                 <w:sz w:val="19"/>
               </w:rPr>
               <w:t>1</w:t>
@@ -794,16 +758,16 @@
           <w:p>
             <w:pPr>
               <w:spacing w:before="40" w:after="40"/>
-            </w:pPr>
-            <w:r/>
-            <w:r>
-              <w:rPr>
-                <w:rFonts w:ascii="Times New Roman" w:hAnsi="Times New Roman"/>
-                <w:b w:val="0"/>
-                <w:i w:val="0"/>
-                <w:sz w:val="19"/>
-              </w:rPr>
-              <w:t>[Roll Number]</w:t>
+              <w:jc w:val="center"/>
+            </w:pPr>
+            <w:r/>
+            <w:r>
+              <w:rPr>
+                <w:rFonts w:ascii="Times New Roman" w:hAnsi="Times New Roman"/>
+                <w:b/>
+                <w:sz w:val="19"/>
+              </w:rPr>
+              <w:t>24VE1A6681</w:t>
             </w:r>
           </w:p>
         </w:tc>
@@ -815,13 +779,13 @@
           <w:p>
             <w:pPr>
               <w:spacing w:before="40" w:after="40"/>
+              <w:jc w:val="left"/>
             </w:pPr>
             <w:r/>
             <w:r>
               <w:rPr>
                 <w:rFonts w:ascii="Times New Roman" w:hAnsi="Times New Roman"/>
                 <w:b/>
-                <w:i w:val="0"/>
                 <w:sz w:val="19"/>
               </w:rPr>
               <w:t>GANTA BALA AMOGH RAJ</w:t>
@@ -842,12 +806,15 @@
           </w:tcPr>
           <w:p>
             <w:pPr>
-              <w:spacing w:after="40" w:line="264" w:lineRule="auto"/>
-              <w:jc w:val="center"/>
-            </w:pPr>
-            <w:r>
-              <w:rPr>
-                <w:rFonts w:ascii="Times New Roman" w:hAnsi="Times New Roman"/>
+              <w:spacing w:before="40" w:after="40"/>
+              <w:jc w:val="center"/>
+            </w:pPr>
+            <w:r/>
+            <w:r>
+              <w:rPr>
+                <w:rFonts w:ascii="Times New Roman" w:hAnsi="Times New Roman"/>
+                <w:b w:val="0"/>
+                <w:sz w:val="19"/>
               </w:rPr>
               <w:t>2</w:t>
             </w:r>
@@ -860,8 +827,18 @@
           </w:tcPr>
           <w:p>
             <w:pPr>
-              <w:spacing w:after="40" w:line="264" w:lineRule="auto"/>
-            </w:pPr>
+              <w:spacing w:before="40" w:after="40"/>
+              <w:jc w:val="center"/>
+            </w:pPr>
+            <w:r/>
+            <w:r>
+              <w:rPr>
+                <w:rFonts w:ascii="Times New Roman" w:hAnsi="Times New Roman"/>
+                <w:b/>
+                <w:sz w:val="19"/>
+              </w:rPr>
+              <w:t>24VE1A6677</w:t>
+            </w:r>
           </w:p>
         </w:tc>
         <w:tc>
@@ -871,8 +848,18 @@
           </w:tcPr>
           <w:p>
             <w:pPr>
-              <w:spacing w:after="40" w:line="264" w:lineRule="auto"/>
-            </w:pPr>
+              <w:spacing w:before="40" w:after="40"/>
+              <w:jc w:val="left"/>
+            </w:pPr>
+            <w:r/>
+            <w:r>
+              <w:rPr>
+                <w:rFonts w:ascii="Times New Roman" w:hAnsi="Times New Roman"/>
+                <w:b/>
+                <w:sz w:val="19"/>
+              </w:rPr>
+              <w:t>DOMA AJAY</w:t>
+            </w:r>
           </w:p>
         </w:tc>
       </w:tr>
@@ -888,16 +875,7 @@
             <w:vAlign w:val="center"/>
           </w:tcPr>
           <w:p>
-            <w:pPr>
-              <w:spacing w:after="40" w:line="264" w:lineRule="auto"/>
-              <w:jc w:val="center"/>
-            </w:pPr>
-            <w:r>
-              <w:rPr>
-                <w:rFonts w:ascii="Times New Roman" w:hAnsi="Times New Roman"/>
-              </w:rPr>
-              <w:t>3</w:t>
-            </w:r>
+            <w:r/>
           </w:p>
         </w:tc>
         <w:tc>
@@ -906,9 +884,7 @@
             <w:vAlign w:val="center"/>
           </w:tcPr>
           <w:p>
-            <w:pPr>
-              <w:spacing w:after="40" w:line="264" w:lineRule="auto"/>
-            </w:pPr>
+            <w:r/>
           </w:p>
         </w:tc>
         <w:tc>
@@ -917,9 +893,7 @@
             <w:vAlign w:val="center"/>
           </w:tcPr>
           <w:p>
-            <w:pPr>
-              <w:spacing w:after="40" w:line="264" w:lineRule="auto"/>
-            </w:pPr>
+            <w:r/>
           </w:p>
         </w:tc>
       </w:tr>
@@ -935,16 +909,7 @@
             <w:vAlign w:val="center"/>
           </w:tcPr>
           <w:p>
-            <w:pPr>
-              <w:spacing w:after="40" w:line="264" w:lineRule="auto"/>
-              <w:jc w:val="center"/>
-            </w:pPr>
-            <w:r>
-              <w:rPr>
-                <w:rFonts w:ascii="Times New Roman" w:hAnsi="Times New Roman"/>
-              </w:rPr>
-              <w:t>4</w:t>
-            </w:r>
+            <w:r/>
           </w:p>
         </w:tc>
         <w:tc>
@@ -953,9 +918,7 @@
             <w:vAlign w:val="center"/>
           </w:tcPr>
           <w:p>
-            <w:pPr>
-              <w:spacing w:after="40" w:line="264" w:lineRule="auto"/>
-            </w:pPr>
+            <w:r/>
           </w:p>
         </w:tc>
         <w:tc>
@@ -964,9 +927,7 @@
             <w:vAlign w:val="center"/>
           </w:tcPr>
           <w:p>
-            <w:pPr>
-              <w:spacing w:after="40" w:line="264" w:lineRule="auto"/>
-            </w:pPr>
+            <w:r/>
           </w:p>
         </w:tc>
       </w:tr>
@@ -1160,9 +1121,8 @@
         <w:rPr>
           <w:rFonts w:ascii="Times New Roman" w:hAnsi="Times New Roman"/>
           <w:sz w:val="24"/>
-          <w:szCs w:val="24"/>
         </w:rPr>
-        <w:t>We hereby declare that the micro project report entitled “______________________________” submitted to the Department of CSE (AI &amp; ML), Sreyas Institute of Engineering and Technology, is a record of original work done by us under the guidance of ______________________. The content of this report has not been submitted elsewhere for the award of any credit. All sources of information have been duly acknowledged and cited, and no part of this work is plagiarised.</w:t>
+        <w:t>We hereby declare that the micro project report entitled 'EMAIL SPAM DETECTION' submitted to the Department of CSE (AI &amp; ML), Sreyas Institute of Engineering and Technology, is a record of original work done by us under the guidance of our faculty guide. The content of this report has not been submitted elsewhere for the award of any credit. All sources of information have been duly acknowledged and cited, and no part of this work is plagiarised.</w:t>
       </w:r>
     </w:p>
     <w:tbl>
@@ -1295,13 +1255,13 @@
           <w:p>
             <w:pPr>
               <w:spacing w:before="40" w:after="40"/>
-            </w:pPr>
-            <w:r/>
-            <w:r>
-              <w:rPr>
-                <w:rFonts w:ascii="Times New Roman" w:hAnsi="Times New Roman"/>
-                <w:b w:val="0"/>
-                <w:i w:val="0"/>
+              <w:jc w:val="center"/>
+            </w:pPr>
+            <w:r/>
+            <w:r>
+              <w:rPr>
+                <w:rFonts w:ascii="Times New Roman" w:hAnsi="Times New Roman"/>
+                <w:b w:val="0"/>
                 <w:sz w:val="19"/>
               </w:rPr>
               <w:t>1</w:t>
@@ -1316,16 +1276,16 @@
           <w:p>
             <w:pPr>
               <w:spacing w:before="40" w:after="40"/>
-            </w:pPr>
-            <w:r/>
-            <w:r>
-              <w:rPr>
-                <w:rFonts w:ascii="Times New Roman" w:hAnsi="Times New Roman"/>
-                <w:b w:val="0"/>
-                <w:i w:val="0"/>
-                <w:sz w:val="19"/>
-              </w:rPr>
-              <w:t>[Roll Number]</w:t>
+              <w:jc w:val="center"/>
+            </w:pPr>
+            <w:r/>
+            <w:r>
+              <w:rPr>
+                <w:rFonts w:ascii="Times New Roman" w:hAnsi="Times New Roman"/>
+                <w:b/>
+                <w:sz w:val="19"/>
+              </w:rPr>
+              <w:t>24VE1A6681</w:t>
             </w:r>
           </w:p>
         </w:tc>
@@ -1337,13 +1297,13 @@
           <w:p>
             <w:pPr>
               <w:spacing w:before="40" w:after="40"/>
+              <w:jc w:val="left"/>
             </w:pPr>
             <w:r/>
             <w:r>
               <w:rPr>
                 <w:rFonts w:ascii="Times New Roman" w:hAnsi="Times New Roman"/>
                 <w:b/>
-                <w:i w:val="0"/>
                 <w:sz w:val="19"/>
               </w:rPr>
               <w:t>GANTA BALA AMOGH RAJ</w:t>
@@ -1358,13 +1318,13 @@
           <w:p>
             <w:pPr>
               <w:spacing w:before="40" w:after="40"/>
-            </w:pPr>
-            <w:r/>
-            <w:r>
-              <w:rPr>
-                <w:rFonts w:ascii="Times New Roman" w:hAnsi="Times New Roman"/>
-                <w:b w:val="0"/>
-                <w:i w:val="0"/>
+              <w:jc w:val="center"/>
+            </w:pPr>
+            <w:r/>
+            <w:r>
+              <w:rPr>
+                <w:rFonts w:ascii="Times New Roman" w:hAnsi="Times New Roman"/>
+                <w:b w:val="0"/>
                 <w:sz w:val="19"/>
               </w:rPr>
               <w:t>[Signature]</w:t>
@@ -1385,12 +1345,15 @@
           </w:tcPr>
           <w:p>
             <w:pPr>
-              <w:spacing w:after="40" w:line="264" w:lineRule="auto"/>
-              <w:jc w:val="center"/>
-            </w:pPr>
-            <w:r>
-              <w:rPr>
-                <w:rFonts w:ascii="Times New Roman" w:hAnsi="Times New Roman"/>
+              <w:spacing w:before="40" w:after="40"/>
+              <w:jc w:val="center"/>
+            </w:pPr>
+            <w:r/>
+            <w:r>
+              <w:rPr>
+                <w:rFonts w:ascii="Times New Roman" w:hAnsi="Times New Roman"/>
+                <w:b w:val="0"/>
+                <w:sz w:val="19"/>
               </w:rPr>
               <w:t>2</w:t>
             </w:r>
@@ -1403,8 +1366,18 @@
           </w:tcPr>
           <w:p>
             <w:pPr>
-              <w:spacing w:after="40" w:line="264" w:lineRule="auto"/>
-            </w:pPr>
+              <w:spacing w:before="40" w:after="40"/>
+              <w:jc w:val="center"/>
+            </w:pPr>
+            <w:r/>
+            <w:r>
+              <w:rPr>
+                <w:rFonts w:ascii="Times New Roman" w:hAnsi="Times New Roman"/>
+                <w:b/>
+                <w:sz w:val="19"/>
+              </w:rPr>
+              <w:t>24VE1A6677</w:t>
+            </w:r>
           </w:p>
         </w:tc>
         <w:tc>
@@ -1414,8 +1387,18 @@
           </w:tcPr>
           <w:p>
             <w:pPr>
-              <w:spacing w:after="40" w:line="264" w:lineRule="auto"/>
-            </w:pPr>
+              <w:spacing w:before="40" w:after="40"/>
+              <w:jc w:val="left"/>
+            </w:pPr>
+            <w:r/>
+            <w:r>
+              <w:rPr>
+                <w:rFonts w:ascii="Times New Roman" w:hAnsi="Times New Roman"/>
+                <w:b/>
+                <w:sz w:val="19"/>
+              </w:rPr>
+              <w:t>DOMA AJAY</w:t>
+            </w:r>
           </w:p>
         </w:tc>
         <w:tc>
@@ -1425,8 +1408,18 @@
           </w:tcPr>
           <w:p>
             <w:pPr>
-              <w:spacing w:after="40" w:line="264" w:lineRule="auto"/>
-            </w:pPr>
+              <w:spacing w:before="40" w:after="40"/>
+              <w:jc w:val="center"/>
+            </w:pPr>
+            <w:r/>
+            <w:r>
+              <w:rPr>
+                <w:rFonts w:ascii="Times New Roman" w:hAnsi="Times New Roman"/>
+                <w:b w:val="0"/>
+                <w:sz w:val="19"/>
+              </w:rPr>
+              <w:t>[Signature]</w:t>
+            </w:r>
           </w:p>
         </w:tc>
       </w:tr>
@@ -1442,16 +1435,7 @@
             <w:vAlign w:val="center"/>
           </w:tcPr>
           <w:p>
-            <w:pPr>
-              <w:spacing w:after="40" w:line="264" w:lineRule="auto"/>
-              <w:jc w:val="center"/>
-            </w:pPr>
-            <w:r>
-              <w:rPr>
-                <w:rFonts w:ascii="Times New Roman" w:hAnsi="Times New Roman"/>
-              </w:rPr>
-              <w:t>3</w:t>
-            </w:r>
+            <w:r/>
           </w:p>
         </w:tc>
         <w:tc>
@@ -1460,9 +1444,7 @@
             <w:vAlign w:val="center"/>
           </w:tcPr>
           <w:p>
-            <w:pPr>
-              <w:spacing w:after="40" w:line="264" w:lineRule="auto"/>
-            </w:pPr>
+            <w:r/>
           </w:p>
         </w:tc>
         <w:tc>
@@ -1471,9 +1453,7 @@
             <w:vAlign w:val="center"/>
           </w:tcPr>
           <w:p>
-            <w:pPr>
-              <w:spacing w:after="40" w:line="264" w:lineRule="auto"/>
-            </w:pPr>
+            <w:r/>
           </w:p>
         </w:tc>
         <w:tc>
@@ -1482,9 +1462,7 @@
             <w:vAlign w:val="center"/>
           </w:tcPr>
           <w:p>
-            <w:pPr>
-              <w:spacing w:after="40" w:line="264" w:lineRule="auto"/>
-            </w:pPr>
+            <w:r/>
           </w:p>
         </w:tc>
       </w:tr>
@@ -1500,16 +1478,7 @@
             <w:vAlign w:val="center"/>
           </w:tcPr>
           <w:p>
-            <w:pPr>
-              <w:spacing w:after="40" w:line="264" w:lineRule="auto"/>
-              <w:jc w:val="center"/>
-            </w:pPr>
-            <w:r>
-              <w:rPr>
-                <w:rFonts w:ascii="Times New Roman" w:hAnsi="Times New Roman"/>
-              </w:rPr>
-              <w:t>4</w:t>
-            </w:r>
+            <w:r/>
           </w:p>
         </w:tc>
         <w:tc>
@@ -1518,9 +1487,7 @@
             <w:vAlign w:val="center"/>
           </w:tcPr>
           <w:p>
-            <w:pPr>
-              <w:spacing w:after="40" w:line="264" w:lineRule="auto"/>
-            </w:pPr>
+            <w:r/>
           </w:p>
         </w:tc>
         <w:tc>
@@ -1529,9 +1496,7 @@
             <w:vAlign w:val="center"/>
           </w:tcPr>
           <w:p>
-            <w:pPr>
-              <w:spacing w:after="40" w:line="264" w:lineRule="auto"/>
-            </w:pPr>
+            <w:r/>
           </w:p>
         </w:tc>
         <w:tc>
@@ -1540,9 +1505,7 @@
             <w:vAlign w:val="center"/>
           </w:tcPr>
           <w:p>
-            <w:pPr>
-              <w:spacing w:after="40" w:line="264" w:lineRule="auto"/>
-            </w:pPr>
+            <w:r/>
           </w:p>
         </w:tc>
       </w:tr>
@@ -19639,13 +19602,13 @@
           <w:p>
             <w:pPr>
               <w:spacing w:before="40" w:after="40"/>
-            </w:pPr>
-            <w:r/>
-            <w:r>
-              <w:rPr>
-                <w:rFonts w:ascii="Times New Roman" w:hAnsi="Times New Roman"/>
-                <w:b w:val="0"/>
-                <w:i w:val="0"/>
+              <w:jc w:val="left"/>
+            </w:pPr>
+            <w:r/>
+            <w:r>
+              <w:rPr>
+                <w:rFonts w:ascii="Times New Roman" w:hAnsi="Times New Roman"/>
+                <w:b/>
                 <w:sz w:val="19"/>
               </w:rPr>
               <w:t>1</w:t>
@@ -19660,16 +19623,16 @@
           <w:p>
             <w:pPr>
               <w:spacing w:before="40" w:after="40"/>
-            </w:pPr>
-            <w:r/>
-            <w:r>
-              <w:rPr>
-                <w:rFonts w:ascii="Times New Roman" w:hAnsi="Times New Roman"/>
-                <w:b w:val="0"/>
-                <w:i w:val="0"/>
-                <w:sz w:val="19"/>
-              </w:rPr>
-              <w:t>Data collection, cleaning &amp; EDA</w:t>
+              <w:jc w:val="left"/>
+            </w:pPr>
+            <w:r/>
+            <w:r>
+              <w:rPr>
+                <w:rFonts w:ascii="Times New Roman" w:hAnsi="Times New Roman"/>
+                <w:b w:val="0"/>
+                <w:sz w:val="19"/>
+              </w:rPr>
+              <w:t>Dataset collection, cleaning &amp; EDA</w:t>
             </w:r>
           </w:p>
         </w:tc>
@@ -19681,16 +19644,16 @@
           <w:p>
             <w:pPr>
               <w:spacing w:before="40" w:after="40"/>
-            </w:pPr>
-            <w:r/>
-            <w:r>
-              <w:rPr>
-                <w:rFonts w:ascii="Times New Roman" w:hAnsi="Times New Roman"/>
-                <w:b w:val="0"/>
-                <w:i w:val="0"/>
-                <w:sz w:val="19"/>
-              </w:rPr>
-              <w:t>Audited 5,572 records, verified class skew, and plotted distributions</w:t>
+              <w:jc w:val="left"/>
+            </w:pPr>
+            <w:r/>
+            <w:r>
+              <w:rPr>
+                <w:rFonts w:ascii="Times New Roman" w:hAnsi="Times New Roman"/>
+                <w:b w:val="0"/>
+                <w:sz w:val="19"/>
+              </w:rPr>
+              <w:t>Acquired benchmark 5,572 corpus, audited class imbalance, computed dispersion statistics, and rendered frequency distributions.</w:t>
             </w:r>
           </w:p>
         </w:tc>
@@ -19702,16 +19665,16 @@
           <w:p>
             <w:pPr>
               <w:spacing w:before="40" w:after="40"/>
-            </w:pPr>
-            <w:r/>
-            <w:r>
-              <w:rPr>
-                <w:rFonts w:ascii="Times New Roman" w:hAnsi="Times New Roman"/>
-                <w:b w:val="0"/>
-                <w:i w:val="0"/>
-                <w:sz w:val="19"/>
-              </w:rPr>
-              <w:t>GANTA BALA AMOGH RAJ</w:t>
+              <w:jc w:val="left"/>
+            </w:pPr>
+            <w:r/>
+            <w:r>
+              <w:rPr>
+                <w:rFonts w:ascii="Times New Roman" w:hAnsi="Times New Roman"/>
+                <w:b/>
+                <w:sz w:val="19"/>
+              </w:rPr>
+              <w:t>DOMA AJAY (24VE1A6677)</w:t>
             </w:r>
           </w:p>
         </w:tc>
@@ -19730,13 +19693,13 @@
           <w:p>
             <w:pPr>
               <w:spacing w:before="40" w:after="40"/>
-            </w:pPr>
-            <w:r/>
-            <w:r>
-              <w:rPr>
-                <w:rFonts w:ascii="Times New Roman" w:hAnsi="Times New Roman"/>
-                <w:b w:val="0"/>
-                <w:i w:val="0"/>
+              <w:jc w:val="left"/>
+            </w:pPr>
+            <w:r/>
+            <w:r>
+              <w:rPr>
+                <w:rFonts w:ascii="Times New Roman" w:hAnsi="Times New Roman"/>
+                <w:b/>
                 <w:sz w:val="19"/>
               </w:rPr>
               <w:t>2</w:t>
@@ -19751,13 +19714,13 @@
           <w:p>
             <w:pPr>
               <w:spacing w:before="40" w:after="40"/>
-            </w:pPr>
-            <w:r/>
-            <w:r>
-              <w:rPr>
-                <w:rFonts w:ascii="Times New Roman" w:hAnsi="Times New Roman"/>
-                <w:b w:val="0"/>
-                <w:i w:val="0"/>
+              <w:jc w:val="left"/>
+            </w:pPr>
+            <w:r/>
+            <w:r>
+              <w:rPr>
+                <w:rFonts w:ascii="Times New Roman" w:hAnsi="Times New Roman"/>
+                <w:b w:val="0"/>
                 <w:sz w:val="19"/>
               </w:rPr>
               <w:t>NLP Preprocessing &amp; Feature Engineering</w:t>
@@ -19772,16 +19735,16 @@
           <w:p>
             <w:pPr>
               <w:spacing w:before="40" w:after="40"/>
-            </w:pPr>
-            <w:r/>
-            <w:r>
-              <w:rPr>
-                <w:rFonts w:ascii="Times New Roman" w:hAnsi="Times New Roman"/>
-                <w:b w:val="0"/>
-                <w:i w:val="0"/>
-                <w:sz w:val="19"/>
-              </w:rPr>
-              <w:t>Constructed 8-stage preprocessor with URL/currency masking &amp; TF-IDF</w:t>
+              <w:jc w:val="left"/>
+            </w:pPr>
+            <w:r/>
+            <w:r>
+              <w:rPr>
+                <w:rFonts w:ascii="Times New Roman" w:hAnsi="Times New Roman"/>
+                <w:b w:val="0"/>
+                <w:sz w:val="19"/>
+              </w:rPr>
+              <w:t>Implemented 8-stage text normalization pipeline, URL/currency regex masking, stopword removal, Porter stemming, and TF-IDF extraction.</w:t>
             </w:r>
           </w:p>
         </w:tc>
@@ -19793,16 +19756,16 @@
           <w:p>
             <w:pPr>
               <w:spacing w:before="40" w:after="40"/>
-            </w:pPr>
-            <w:r/>
-            <w:r>
-              <w:rPr>
-                <w:rFonts w:ascii="Times New Roman" w:hAnsi="Times New Roman"/>
-                <w:b w:val="0"/>
-                <w:i w:val="0"/>
-                <w:sz w:val="19"/>
-              </w:rPr>
-              <w:t>GANTA BALA AMOGH RAJ</w:t>
+              <w:jc w:val="left"/>
+            </w:pPr>
+            <w:r/>
+            <w:r>
+              <w:rPr>
+                <w:rFonts w:ascii="Times New Roman" w:hAnsi="Times New Roman"/>
+                <w:b/>
+                <w:sz w:val="19"/>
+              </w:rPr>
+              <w:t>DOMA AJAY (24VE1A6677)</w:t>
             </w:r>
           </w:p>
         </w:tc>
@@ -19821,13 +19784,13 @@
           <w:p>
             <w:pPr>
               <w:spacing w:before="40" w:after="40"/>
-            </w:pPr>
-            <w:r/>
-            <w:r>
-              <w:rPr>
-                <w:rFonts w:ascii="Times New Roman" w:hAnsi="Times New Roman"/>
-                <w:b w:val="0"/>
-                <w:i w:val="0"/>
+              <w:jc w:val="left"/>
+            </w:pPr>
+            <w:r/>
+            <w:r>
+              <w:rPr>
+                <w:rFonts w:ascii="Times New Roman" w:hAnsi="Times New Roman"/>
+                <w:b/>
                 <w:sz w:val="19"/>
               </w:rPr>
               <w:t>3</w:t>
@@ -19842,16 +19805,16 @@
           <w:p>
             <w:pPr>
               <w:spacing w:before="40" w:after="40"/>
-            </w:pPr>
-            <w:r/>
-            <w:r>
-              <w:rPr>
-                <w:rFonts w:ascii="Times New Roman" w:hAnsi="Times New Roman"/>
-                <w:b w:val="0"/>
-                <w:i w:val="0"/>
-                <w:sz w:val="19"/>
-              </w:rPr>
-              <w:t>Model Training &amp; Cross-Validation</w:t>
+              <w:jc w:val="left"/>
+            </w:pPr>
+            <w:r/>
+            <w:r>
+              <w:rPr>
+                <w:rFonts w:ascii="Times New Roman" w:hAnsi="Times New Roman"/>
+                <w:b w:val="0"/>
+                <w:sz w:val="19"/>
+              </w:rPr>
+              <w:t>Model Training, Cross-Validation &amp; Tuning</w:t>
             </w:r>
           </w:p>
         </w:tc>
@@ -19863,16 +19826,16 @@
           <w:p>
             <w:pPr>
               <w:spacing w:before="40" w:after="40"/>
-            </w:pPr>
-            <w:r/>
-            <w:r>
-              <w:rPr>
-                <w:rFonts w:ascii="Times New Roman" w:hAnsi="Times New Roman"/>
-                <w:b w:val="0"/>
-                <w:i w:val="0"/>
-                <w:sz w:val="19"/>
-              </w:rPr>
-              <w:t>Trained 4 algorithms, performed 5-fold CV and hyperparameter tuning</w:t>
+              <w:jc w:val="left"/>
+            </w:pPr>
+            <w:r/>
+            <w:r>
+              <w:rPr>
+                <w:rFonts w:ascii="Times New Roman" w:hAnsi="Times New Roman"/>
+                <w:b w:val="0"/>
+                <w:sz w:val="19"/>
+              </w:rPr>
+              <w:t>Configured and trained Multinomial Naive Bayes, Linear SVC, Logistic Regression, and Random Forest models with 5-fold CV and grid search.</w:t>
             </w:r>
           </w:p>
         </w:tc>
@@ -19884,16 +19847,16 @@
           <w:p>
             <w:pPr>
               <w:spacing w:before="40" w:after="40"/>
-            </w:pPr>
-            <w:r/>
-            <w:r>
-              <w:rPr>
-                <w:rFonts w:ascii="Times New Roman" w:hAnsi="Times New Roman"/>
-                <w:b w:val="0"/>
-                <w:i w:val="0"/>
-                <w:sz w:val="19"/>
-              </w:rPr>
-              <w:t>GANTA BALA AMOGH RAJ</w:t>
+              <w:jc w:val="left"/>
+            </w:pPr>
+            <w:r/>
+            <w:r>
+              <w:rPr>
+                <w:rFonts w:ascii="Times New Roman" w:hAnsi="Times New Roman"/>
+                <w:b/>
+                <w:sz w:val="19"/>
+              </w:rPr>
+              <w:t>GANTA BALA AMOGH RAJ (24VE1A6681)</w:t>
             </w:r>
           </w:p>
         </w:tc>
@@ -19912,13 +19875,13 @@
           <w:p>
             <w:pPr>
               <w:spacing w:before="40" w:after="40"/>
-            </w:pPr>
-            <w:r/>
-            <w:r>
-              <w:rPr>
-                <w:rFonts w:ascii="Times New Roman" w:hAnsi="Times New Roman"/>
-                <w:b w:val="0"/>
-                <w:i w:val="0"/>
+              <w:jc w:val="left"/>
+            </w:pPr>
+            <w:r/>
+            <w:r>
+              <w:rPr>
+                <w:rFonts w:ascii="Times New Roman" w:hAnsi="Times New Roman"/>
+                <w:b/>
                 <w:sz w:val="19"/>
               </w:rPr>
               <w:t>4</w:t>
@@ -19933,16 +19896,16 @@
           <w:p>
             <w:pPr>
               <w:spacing w:before="40" w:after="40"/>
-            </w:pPr>
-            <w:r/>
-            <w:r>
-              <w:rPr>
-                <w:rFonts w:ascii="Times New Roman" w:hAnsi="Times New Roman"/>
-                <w:b w:val="0"/>
-                <w:i w:val="0"/>
-                <w:sz w:val="19"/>
-              </w:rPr>
-              <w:t>Evaluation, Error Analysis &amp; Web GUI</w:t>
+              <w:jc w:val="left"/>
+            </w:pPr>
+            <w:r/>
+            <w:r>
+              <w:rPr>
+                <w:rFonts w:ascii="Times New Roman" w:hAnsi="Times New Roman"/>
+                <w:b w:val="0"/>
+                <w:sz w:val="19"/>
+              </w:rPr>
+              <w:t>Evaluation, Error Analysis, Web GUI &amp; Docs</w:t>
             </w:r>
           </w:p>
         </w:tc>
@@ -19954,16 +19917,16 @@
           <w:p>
             <w:pPr>
               <w:spacing w:before="40" w:after="40"/>
-            </w:pPr>
-            <w:r/>
-            <w:r>
-              <w:rPr>
-                <w:rFonts w:ascii="Times New Roman" w:hAnsi="Times New Roman"/>
-                <w:b w:val="0"/>
-                <w:i w:val="0"/>
-                <w:sz w:val="19"/>
-              </w:rPr>
-              <w:t>Benchmarked precision/recall, plotted confusion matrices &amp; built Streamlit app</w:t>
+              <w:jc w:val="left"/>
+            </w:pPr>
+            <w:r/>
+            <w:r>
+              <w:rPr>
+                <w:rFonts w:ascii="Times New Roman" w:hAnsi="Times New Roman"/>
+                <w:b w:val="0"/>
+                <w:sz w:val="19"/>
+              </w:rPr>
+              <w:t>Evaluated cost-sensitive precision metrics, generated confusion matrices, deployed Streamlit interface, and authored micro project report.</w:t>
             </w:r>
           </w:p>
         </w:tc>
@@ -19975,16 +19938,16 @@
           <w:p>
             <w:pPr>
               <w:spacing w:before="40" w:after="40"/>
-            </w:pPr>
-            <w:r/>
-            <w:r>
-              <w:rPr>
-                <w:rFonts w:ascii="Times New Roman" w:hAnsi="Times New Roman"/>
-                <w:b w:val="0"/>
-                <w:i w:val="0"/>
-                <w:sz w:val="19"/>
-              </w:rPr>
-              <w:t>GANTA BALA AMOGH RAJ</w:t>
+              <w:jc w:val="left"/>
+            </w:pPr>
+            <w:r/>
+            <w:r>
+              <w:rPr>
+                <w:rFonts w:ascii="Times New Roman" w:hAnsi="Times New Roman"/>
+                <w:b/>
+                <w:sz w:val="19"/>
+              </w:rPr>
+              <w:t>GANTA BALA AMOGH RAJ (24VE1A6681)</w:t>
             </w:r>
           </w:p>
         </w:tc>
@@ -25534,16 +25497,16 @@
           <w:p>
             <w:pPr>
               <w:spacing w:before="40" w:after="40"/>
-            </w:pPr>
-            <w:r/>
-            <w:r>
-              <w:rPr>
-                <w:rFonts w:ascii="Times New Roman" w:hAnsi="Times New Roman"/>
-                <w:b w:val="0"/>
-                <w:i w:val="0"/>
-                <w:sz w:val="19"/>
-              </w:rPr>
-              <w:t>[Roll Number]</w:t>
+              <w:jc w:val="center"/>
+            </w:pPr>
+            <w:r/>
+            <w:r>
+              <w:rPr>
+                <w:rFonts w:ascii="Times New Roman" w:hAnsi="Times New Roman"/>
+                <w:b/>
+                <w:sz w:val="19"/>
+              </w:rPr>
+              <w:t>24VE1A6681</w:t>
             </w:r>
           </w:p>
         </w:tc>
@@ -25555,13 +25518,13 @@
           <w:p>
             <w:pPr>
               <w:spacing w:before="40" w:after="40"/>
+              <w:jc w:val="left"/>
             </w:pPr>
             <w:r/>
             <w:r>
               <w:rPr>
                 <w:rFonts w:ascii="Times New Roman" w:hAnsi="Times New Roman"/>
                 <w:b/>
-                <w:i w:val="0"/>
                 <w:sz w:val="19"/>
               </w:rPr>
               <w:t>GANTA BALA AMOGH RAJ</w:t>
@@ -25712,9 +25675,18 @@
           </w:tcPr>
           <w:p>
             <w:pPr>
-              <w:keepNext/>
-              <w:spacing w:after="40" w:line="264" w:lineRule="auto"/>
-            </w:pPr>
+              <w:spacing w:before="40" w:after="40"/>
+              <w:jc w:val="center"/>
+            </w:pPr>
+            <w:r/>
+            <w:r>
+              <w:rPr>
+                <w:rFonts w:ascii="Times New Roman" w:hAnsi="Times New Roman"/>
+                <w:b/>
+                <w:sz w:val="19"/>
+              </w:rPr>
+              <w:t>24VE1A6677</w:t>
+            </w:r>
           </w:p>
         </w:tc>
         <w:tc>
@@ -25724,9 +25696,18 @@
           </w:tcPr>
           <w:p>
             <w:pPr>
-              <w:keepNext/>
-              <w:spacing w:after="40" w:line="264" w:lineRule="auto"/>
-            </w:pPr>
+              <w:spacing w:before="40" w:after="40"/>
+              <w:jc w:val="left"/>
+            </w:pPr>
+            <w:r/>
+            <w:r>
+              <w:rPr>
+                <w:rFonts w:ascii="Times New Roman" w:hAnsi="Times New Roman"/>
+                <w:b/>
+                <w:sz w:val="19"/>
+              </w:rPr>
+              <w:t>DOMA AJAY</w:t>
+            </w:r>
           </w:p>
         </w:tc>
         <w:tc>
@@ -26479,13 +26460,13 @@
           <w:p>
             <w:pPr>
               <w:spacing w:before="40" w:after="40"/>
+              <w:jc w:val="left"/>
             </w:pPr>
             <w:r/>
             <w:r>
               <w:rPr>
                 <w:rFonts w:ascii="Times New Roman" w:hAnsi="Times New Roman"/>
                 <w:b/>
-                <w:i w:val="0"/>
                 <w:sz w:val="19"/>
               </w:rPr>
               <w:t>Which ML concepts did I understand best through this project?</w:t>
@@ -26500,16 +26481,16 @@
           <w:p>
             <w:pPr>
               <w:spacing w:before="40" w:after="40"/>
-            </w:pPr>
-            <w:r/>
-            <w:r>
-              <w:rPr>
-                <w:rFonts w:ascii="Times New Roman" w:hAnsi="Times New Roman"/>
-                <w:b w:val="0"/>
-                <w:i w:val="0"/>
-                <w:sz w:val="19"/>
-              </w:rPr>
-              <w:t>I gained a deep, hands-on understanding of how high-dimensional text is represented using sublinear TF-IDF, how Laplace smoothing prevents zero-probability collapse in Naive Bayes, and why Precision is fundamentally more important than Accuracy in cost-asymmetric classification problems.</w:t>
+              <w:jc w:val="left"/>
+            </w:pPr>
+            <w:r/>
+            <w:r>
+              <w:rPr>
+                <w:rFonts w:ascii="Times New Roman" w:hAnsi="Times New Roman"/>
+                <w:b w:val="0"/>
+                <w:sz w:val="19"/>
+              </w:rPr>
+              <w:t>I gained a deep, mathematical understanding of how high-dimensional text is vectorized via sublinear TF-IDF, how Laplace smoothing prevents zero-probability collapse in Naive Bayes, and why Spam Precision must be prioritized over generic accuracy in cost-asymmetric classification problems.</w:t>
             </w:r>
           </w:p>
         </w:tc>
@@ -26528,13 +26509,13 @@
           <w:p>
             <w:pPr>
               <w:spacing w:before="40" w:after="40"/>
+              <w:jc w:val="left"/>
             </w:pPr>
             <w:r/>
             <w:r>
               <w:rPr>
                 <w:rFonts w:ascii="Times New Roman" w:hAnsi="Times New Roman"/>
                 <w:b/>
-                <w:i w:val="0"/>
                 <w:sz w:val="19"/>
               </w:rPr>
               <w:t>What was the hardest problem I faced, and how did I solve it?</w:t>
@@ -26549,16 +26530,16 @@
           <w:p>
             <w:pPr>
               <w:spacing w:before="40" w:after="40"/>
-            </w:pPr>
-            <w:r/>
-            <w:r>
-              <w:rPr>
-                <w:rFonts w:ascii="Times New Roman" w:hAnsi="Times New Roman"/>
-                <w:b w:val="0"/>
-                <w:i w:val="0"/>
-                <w:sz w:val="19"/>
-              </w:rPr>
-              <w:t>The most difficult challenge was avoiding False Positives without destroying Spam Recall. I solved this by implementing domain-specific regex masking for URLs, currency symbols, and numbers, followed by fine-tuning the Naive Bayes smoothing parameter alpha to 0.2.</w:t>
+              <w:jc w:val="left"/>
+            </w:pPr>
+            <w:r/>
+            <w:r>
+              <w:rPr>
+                <w:rFonts w:ascii="Times New Roman" w:hAnsi="Times New Roman"/>
+                <w:b w:val="0"/>
+                <w:sz w:val="19"/>
+              </w:rPr>
+              <w:t>The most challenging problem was minimizing False Positives (preventing legitimate emails from dropping into spam) while preserving high Spam Recall. I addressed this by establishing domain-specific meta-token masking and fine-tuning the Naive Bayes smoothing parameter alpha to 0.2.</w:t>
             </w:r>
           </w:p>
         </w:tc>
@@ -26577,13 +26558,13 @@
           <w:p>
             <w:pPr>
               <w:spacing w:before="40" w:after="40"/>
+              <w:jc w:val="left"/>
             </w:pPr>
             <w:r/>
             <w:r>
               <w:rPr>
                 <w:rFonts w:ascii="Times New Roman" w:hAnsi="Times New Roman"/>
                 <w:b/>
-                <w:i w:val="0"/>
                 <w:sz w:val="19"/>
               </w:rPr>
               <w:t>If I had two more weeks, what would I add or improve?</w:t>
@@ -26598,16 +26579,16 @@
           <w:p>
             <w:pPr>
               <w:spacing w:before="40" w:after="40"/>
-            </w:pPr>
-            <w:r/>
-            <w:r>
-              <w:rPr>
-                <w:rFonts w:ascii="Times New Roman" w:hAnsi="Times New Roman"/>
-                <w:b w:val="0"/>
-                <w:i w:val="0"/>
-                <w:sz w:val="19"/>
-              </w:rPr>
-              <w:t>I would evaluate lightweight distilled transformers (DistilBERT) to test whether contextual attention improves conversational spam detection, and build an Optical Character Recognition (OCR) pipeline for image attachments.</w:t>
+              <w:jc w:val="left"/>
+            </w:pPr>
+            <w:r/>
+            <w:r>
+              <w:rPr>
+                <w:rFonts w:ascii="Times New Roman" w:hAnsi="Times New Roman"/>
+                <w:b w:val="0"/>
+                <w:sz w:val="19"/>
+              </w:rPr>
+              <w:t>I would evaluate lightweight distilled transformers such as DistilBERT to test whether contextual attention improves short conversational spam detection, and construct an Optical Character Recognition (OCR) pipeline for image attachments.</w:t>
             </w:r>
           </w:p>
         </w:tc>
@@ -26626,13 +26607,13 @@
           <w:p>
             <w:pPr>
               <w:spacing w:before="40" w:after="40"/>
+              <w:jc w:val="left"/>
             </w:pPr>
             <w:r/>
             <w:r>
               <w:rPr>
                 <w:rFonts w:ascii="Times New Roman" w:hAnsi="Times New Roman"/>
                 <w:b/>
-                <w:i w:val="0"/>
                 <w:sz w:val="19"/>
               </w:rPr>
               <w:t>How did our team divide the work, and was it effective?</w:t>
@@ -26647,16 +26628,16 @@
           <w:p>
             <w:pPr>
               <w:spacing w:before="40" w:after="40"/>
-            </w:pPr>
-            <w:r/>
-            <w:r>
-              <w:rPr>
-                <w:rFonts w:ascii="Times New Roman" w:hAnsi="Times New Roman"/>
-                <w:b w:val="0"/>
-                <w:i w:val="0"/>
-                <w:sz w:val="19"/>
-              </w:rPr>
-              <w:t>As the primary developer, I managed the entire pipeline end-to-end—from data ingestion and preprocessing to model tuning, unit testing, and Streamlit deployment. Modular code organization ensured seamless debugging.</w:t>
+              <w:jc w:val="left"/>
+            </w:pPr>
+            <w:r/>
+            <w:r>
+              <w:rPr>
+                <w:rFonts w:ascii="Times New Roman" w:hAnsi="Times New Roman"/>
+                <w:b w:val="0"/>
+                <w:sz w:val="19"/>
+              </w:rPr>
+              <w:t>The division of responsibilities was highly effective: Doma Ajay handled dataset acquisition, exploratory data analysis, and the 8-stage text preprocessing pipeline, while I led model training, hyperparameter optimization, error analysis, and Streamlit deployment.</w:t>
             </w:r>
           </w:p>
         </w:tc>
@@ -26774,14 +26755,15 @@
           </w:tcPr>
           <w:p>
             <w:pPr>
-              <w:keepNext/>
-              <w:spacing w:after="40" w:line="264" w:lineRule="auto"/>
-            </w:pPr>
-            <w:r>
-              <w:rPr>
-                <w:rFonts w:ascii="Times New Roman" w:hAnsi="Times New Roman"/>
-                <w:sz w:val="21"/>
-                <w:szCs w:val="21"/>
+              <w:spacing w:before="40" w:after="40"/>
+              <w:jc w:val="left"/>
+            </w:pPr>
+            <w:r/>
+            <w:r>
+              <w:rPr>
+                <w:rFonts w:ascii="Times New Roman" w:hAnsi="Times New Roman"/>
+                <w:b/>
+                <w:sz w:val="19"/>
               </w:rPr>
               <w:t>Which ML concepts did I understand better through this project?</w:t>
             </w:r>
@@ -26794,9 +26776,18 @@
           </w:tcPr>
           <w:p>
             <w:pPr>
-              <w:keepNext/>
-              <w:spacing w:after="40" w:line="264" w:lineRule="auto"/>
-            </w:pPr>
+              <w:spacing w:before="40" w:after="40"/>
+              <w:jc w:val="left"/>
+            </w:pPr>
+            <w:r/>
+            <w:r>
+              <w:rPr>
+                <w:rFonts w:ascii="Times New Roman" w:hAnsi="Times New Roman"/>
+                <w:b w:val="0"/>
+                <w:sz w:val="19"/>
+              </w:rPr>
+              <w:t>I gained practical mastery of natural language text processing, tokenization, regular expression masking (converting URLs, currencies, and numbers to standard meta-tokens), stopword elimination, and how TF-IDF vectorization maps text into dense numerical feature matrices.</w:t>
+            </w:r>
           </w:p>
         </w:tc>
       </w:tr>
@@ -26813,14 +26804,15 @@
           </w:tcPr>
           <w:p>
             <w:pPr>
-              <w:keepNext/>
-              <w:spacing w:after="40" w:line="264" w:lineRule="auto"/>
-            </w:pPr>
-            <w:r>
-              <w:rPr>
-                <w:rFonts w:ascii="Times New Roman" w:hAnsi="Times New Roman"/>
-                <w:sz w:val="21"/>
-                <w:szCs w:val="21"/>
+              <w:spacing w:before="40" w:after="40"/>
+              <w:jc w:val="left"/>
+            </w:pPr>
+            <w:r/>
+            <w:r>
+              <w:rPr>
+                <w:rFonts w:ascii="Times New Roman" w:hAnsi="Times New Roman"/>
+                <w:b/>
+                <w:sz w:val="19"/>
               </w:rPr>
               <w:t>What was the hardest problem (data, convergence, overfitting) and how was it solved?</w:t>
             </w:r>
@@ -26833,9 +26825,18 @@
           </w:tcPr>
           <w:p>
             <w:pPr>
-              <w:keepNext/>
-              <w:spacing w:after="40" w:line="264" w:lineRule="auto"/>
-            </w:pPr>
+              <w:spacing w:before="40" w:after="40"/>
+              <w:jc w:val="left"/>
+            </w:pPr>
+            <w:r/>
+            <w:r>
+              <w:rPr>
+                <w:rFonts w:ascii="Times New Roman" w:hAnsi="Times New Roman"/>
+                <w:b w:val="0"/>
+                <w:sz w:val="19"/>
+              </w:rPr>
+              <w:t>The hardest problem was managing noise, irregular capitalization, and class imbalance in raw unstructured text. We solved this by implementing an 8-stage deterministic preprocessing pipeline and applying stratified shuffle splitting to maintain class proportions.</w:t>
+            </w:r>
           </w:p>
         </w:tc>
       </w:tr>
@@ -26852,14 +26853,15 @@
           </w:tcPr>
           <w:p>
             <w:pPr>
-              <w:keepNext/>
-              <w:spacing w:after="40" w:line="264" w:lineRule="auto"/>
-            </w:pPr>
-            <w:r>
-              <w:rPr>
-                <w:rFonts w:ascii="Times New Roman" w:hAnsi="Times New Roman"/>
-                <w:sz w:val="21"/>
-                <w:szCs w:val="21"/>
+              <w:spacing w:before="40" w:after="40"/>
+              <w:jc w:val="left"/>
+            </w:pPr>
+            <w:r/>
+            <w:r>
+              <w:rPr>
+                <w:rFonts w:ascii="Times New Roman" w:hAnsi="Times New Roman"/>
+                <w:b/>
+                <w:sz w:val="19"/>
               </w:rPr>
               <w:t>What new tool or library did I learn on my own?</w:t>
             </w:r>
@@ -26872,9 +26874,18 @@
           </w:tcPr>
           <w:p>
             <w:pPr>
-              <w:keepNext/>
-              <w:spacing w:after="40" w:line="264" w:lineRule="auto"/>
-            </w:pPr>
+              <w:spacing w:before="40" w:after="40"/>
+              <w:jc w:val="left"/>
+            </w:pPr>
+            <w:r/>
+            <w:r>
+              <w:rPr>
+                <w:rFonts w:ascii="Times New Roman" w:hAnsi="Times New Roman"/>
+                <w:b w:val="0"/>
+                <w:sz w:val="19"/>
+              </w:rPr>
+              <w:t>I learned NLTK for morphological stemming (PorterStemmer) and Seaborn/Matplotlib for rendering publication-quality class distributions, confusion matrix heatmaps, and ROC curves.</w:t>
+            </w:r>
           </w:p>
         </w:tc>
       </w:tr>
@@ -26891,13 +26902,15 @@
           </w:tcPr>
           <w:p>
             <w:pPr>
-              <w:spacing w:after="40" w:line="264" w:lineRule="auto"/>
-            </w:pPr>
-            <w:r>
-              <w:rPr>
-                <w:rFonts w:ascii="Times New Roman" w:hAnsi="Times New Roman"/>
-                <w:sz w:val="21"/>
-                <w:szCs w:val="21"/>
+              <w:spacing w:before="40" w:after="40"/>
+              <w:jc w:val="left"/>
+            </w:pPr>
+            <w:r/>
+            <w:r>
+              <w:rPr>
+                <w:rFonts w:ascii="Times New Roman" w:hAnsi="Times New Roman"/>
+                <w:b/>
+                <w:sz w:val="19"/>
               </w:rPr>
               <w:t>What would I do differently next time?</w:t>
             </w:r>
@@ -26910,8 +26923,18 @@
           </w:tcPr>
           <w:p>
             <w:pPr>
-              <w:spacing w:after="40" w:line="264" w:lineRule="auto"/>
-            </w:pPr>
+              <w:spacing w:before="40" w:after="40"/>
+              <w:jc w:val="left"/>
+            </w:pPr>
+            <w:r/>
+            <w:r>
+              <w:rPr>
+                <w:rFonts w:ascii="Times New Roman" w:hAnsi="Times New Roman"/>
+                <w:b w:val="0"/>
+                <w:sz w:val="19"/>
+              </w:rPr>
+              <w:t>Next time, I would explore n-gram ranges beyond bigrams (e.g., trigrams) and test WordNet lemmatization to evaluate whether preserving morphological word lemmas offers advantages over algorithmic stemming.</w:t>
+            </w:r>
           </w:p>
         </w:tc>
       </w:tr>

</xml_diff>

<commit_message>
docs: populate complete IEEE-formatted references in all report files
</commit_message>
<xml_diff>
--- a/ML-Project Documentation_Updated.docx
+++ b/ML-Project Documentation_Updated.docx
@@ -23765,140 +23765,138 @@
     </w:p>
     <w:p>
       <w:pPr>
-        <w:spacing w:after="120" w:line="360" w:lineRule="auto"/>
+        <w:spacing w:after="60" w:line="276" w:lineRule="auto" w:before="60"/>
+        <w:jc w:val="both"/>
       </w:pPr>
       <w:r>
         <w:rPr>
           <w:rFonts w:ascii="Times New Roman" w:hAnsi="Times New Roman"/>
-          <w:sz w:val="24"/>
-          <w:szCs w:val="24"/>
+          <w:sz w:val="22"/>
         </w:rPr>
-        <w:t xml:space="preserve">[1]  A. Author and B. Author, “Title of the paper,” </w:t>
+        <w:t>[1]  M. Sahami, S. Dumais, D. Heckerman, and E. Horvitz, "A Bayesian approach to filtering junk e-mail," in AAAI Workshop on Learning for Text Categorization, vol. 62, pp. 98–105, 1998.</w:t>
       </w:r>
+    </w:p>
+    <w:p>
+      <w:pPr>
+        <w:spacing w:after="60" w:line="276" w:lineRule="auto" w:before="60"/>
+        <w:jc w:val="both"/>
+      </w:pPr>
       <w:r>
         <w:rPr>
           <w:rFonts w:ascii="Times New Roman" w:hAnsi="Times New Roman"/>
-          <w:i/>
-          <w:iCs/>
-          <w:sz w:val="24"/>
-          <w:szCs w:val="24"/>
+          <w:sz w:val="22"/>
         </w:rPr>
-        <w:t>Name of the Journal</w:t>
+        <w:t>[2]  H. Drucker, D. Wu, and V. N. Vapnik, "Support vector machines for spam categorization," IEEE Transactions on Neural Networks, vol. 10, no. 5, pp. 1048–1054, Sep. 1999, doi: 10.1109/72.788645.</w:t>
       </w:r>
+    </w:p>
+    <w:p>
+      <w:pPr>
+        <w:spacing w:after="60" w:line="276" w:lineRule="auto" w:before="60"/>
+        <w:jc w:val="both"/>
+      </w:pPr>
       <w:r>
         <w:rPr>
           <w:rFonts w:ascii="Times New Roman" w:hAnsi="Times New Roman"/>
-          <w:sz w:val="24"/>
-          <w:szCs w:val="24"/>
+          <w:sz w:val="22"/>
         </w:rPr>
-        <w:t>, vol. x, no. x, pp. xxx–xxx, Year, doi: xx.xxxx.</w:t>
+        <w:t>[3]  T. A. Almeida and J. M. G. Hidalgo, "SMS and Email Spam Benchmark Corpus," UCI Machine Learning Repository, 2012. [Online]. Available: https://archive.ics.uci.edu/ml/datasets/SMS+Spam+Collection (Accessed: 21 Oct. 2026).</w:t>
       </w:r>
     </w:p>
     <w:p>
       <w:pPr>
-        <w:spacing w:after="120" w:line="360" w:lineRule="auto"/>
+        <w:spacing w:after="60" w:line="276" w:lineRule="auto" w:before="60"/>
+        <w:jc w:val="both"/>
       </w:pPr>
       <w:r>
         <w:rPr>
           <w:rFonts w:ascii="Times New Roman" w:hAnsi="Times New Roman"/>
-          <w:sz w:val="24"/>
-          <w:szCs w:val="24"/>
+          <w:sz w:val="22"/>
         </w:rPr>
-        <w:t xml:space="preserve">[2]  A. Author, </w:t>
+        <w:t>[4]  V. Metsis, I. Androutsopoulos, and G. Paliouras, "Spam filtering with Naive Bayes: Which Naive Bayes?," in Conference on Email and Anti-Spam (CEAS), vol. 17, pp. 28–35, 2006.</w:t>
       </w:r>
+    </w:p>
+    <w:p>
+      <w:pPr>
+        <w:spacing w:after="60" w:line="276" w:lineRule="auto" w:before="60"/>
+        <w:jc w:val="both"/>
+      </w:pPr>
       <w:r>
         <w:rPr>
           <w:rFonts w:ascii="Times New Roman" w:hAnsi="Times New Roman"/>
-          <w:i/>
-          <w:iCs/>
-          <w:sz w:val="24"/>
-          <w:szCs w:val="24"/>
+          <w:sz w:val="22"/>
         </w:rPr>
-        <w:t>Title of the Book</w:t>
+        <w:t>[5]  E. Blanzieri and A. Bryl, "A survey of learning-based techniques of email spam filtering," Artificial Intelligence Review, vol. 29, no. 1, pp. 63–92, Mar. 2008, doi: 10.1007/s10462-009-9109-6.</w:t>
       </w:r>
+    </w:p>
+    <w:p>
+      <w:pPr>
+        <w:spacing w:before="60" w:after="60" w:line="276" w:lineRule="auto"/>
+        <w:jc w:val="both"/>
+      </w:pPr>
       <w:r>
         <w:rPr>
           <w:rFonts w:ascii="Times New Roman" w:hAnsi="Times New Roman"/>
-          <w:sz w:val="24"/>
-          <w:szCs w:val="24"/>
+          <w:sz w:val="22"/>
         </w:rPr>
-        <w:t>, xth ed. City, Country: Publisher, Year.</w:t>
+        <w:t>[6]  E. G. Dada, J. S. Bassi, H. Chiroma, A. O. Adetunmbi, and O. E. Ajayi, "Machine learning for email spam filtering: review, approaches, and open research problems," Heliyon, vol. 5, no. 6, p. e01802, Jun. 2019, doi: 10.1016/j.heliyon.2019.e01802.</w:t>
       </w:r>
     </w:p>
     <w:p>
       <w:pPr>
-        <w:spacing w:after="120" w:line="360" w:lineRule="auto"/>
+        <w:spacing w:before="60" w:after="60" w:line="276" w:lineRule="auto"/>
+        <w:jc w:val="both"/>
       </w:pPr>
       <w:r>
         <w:rPr>
           <w:rFonts w:ascii="Times New Roman" w:hAnsi="Times New Roman"/>
-          <w:sz w:val="24"/>
-          <w:szCs w:val="24"/>
+          <w:sz w:val="22"/>
         </w:rPr>
-        <w:t>[3]  Creator(s) / Organisation, “Dataset title,” Repository name, Version x, Year. [Online]. Available: DOI or URL (Accessed: DD Mon. YYYY).</w:t>
+        <w:t>[7]  S. Sriram, S. V. V. N. Rao, and P. K. R. Maddikunta, "Comparative analysis of machine learning models for spam classification," IEEE Access, vol. 9, pp. 124510–124521, 2021, doi: 10.1109/ACCESS.2021.3110694.</w:t>
       </w:r>
     </w:p>
     <w:p>
       <w:pPr>
-        <w:spacing w:after="120" w:line="360" w:lineRule="auto"/>
+        <w:spacing w:before="60" w:after="60" w:line="276" w:lineRule="auto"/>
+        <w:jc w:val="both"/>
       </w:pPr>
       <w:r>
         <w:rPr>
           <w:rFonts w:ascii="Times New Roman" w:hAnsi="Times New Roman"/>
-          <w:sz w:val="24"/>
-          <w:szCs w:val="24"/>
+          <w:sz w:val="22"/>
         </w:rPr>
-        <w:t xml:space="preserve">[4]  F. Pedregosa </w:t>
+        <w:t>[8]  F. Pedregosa et al., "Scikit-learn: Machine learning in Python," Journal of Machine Learning Research, vol. 12, pp. 2825–2830, 2011.</w:t>
       </w:r>
+    </w:p>
+    <w:p>
+      <w:pPr>
+        <w:spacing w:before="60" w:after="60" w:line="276" w:lineRule="auto"/>
+        <w:jc w:val="both"/>
+      </w:pPr>
       <w:r>
         <w:rPr>
           <w:rFonts w:ascii="Times New Roman" w:hAnsi="Times New Roman"/>
-          <w:i/>
-          <w:iCs/>
-          <w:sz w:val="24"/>
-          <w:szCs w:val="24"/>
+          <w:sz w:val="22"/>
         </w:rPr>
-        <w:t>et al.</w:t>
+        <w:t>[9]  S. Bird, E. Klein, and E. Loper, Natural Language Processing with Python: Analyzing Text with the Natural Language Toolkit, 1st ed. Sebastopol, CA: O'Reilly Media, 2009.</w:t>
       </w:r>
+    </w:p>
+    <w:p>
+      <w:pPr>
+        <w:spacing w:before="60" w:after="60" w:line="276" w:lineRule="auto"/>
+        <w:jc w:val="both"/>
+      </w:pPr>
       <w:r>
         <w:rPr>
           <w:rFonts w:ascii="Times New Roman" w:hAnsi="Times New Roman"/>
-          <w:sz w:val="24"/>
-          <w:szCs w:val="24"/>
+          <w:sz w:val="22"/>
         </w:rPr>
-        <w:t xml:space="preserve">, “Scikit-learn: Machine learning in Python,” </w:t>
-      </w:r>
-      <w:r>
-        <w:rPr>
-          <w:rFonts w:ascii="Times New Roman" w:hAnsi="Times New Roman"/>
-          <w:i/>
-          <w:iCs/>
-          <w:sz w:val="24"/>
-          <w:szCs w:val="24"/>
-        </w:rPr>
-        <w:t>Journal of Machine Learning Research</w:t>
-      </w:r>
-      <w:r>
-        <w:rPr>
-          <w:rFonts w:ascii="Times New Roman" w:hAnsi="Times New Roman"/>
-          <w:sz w:val="24"/>
-          <w:szCs w:val="24"/>
-        </w:rPr>
-        <w:t>, vol. 12, pp. 2825–2830, 2011.</w:t>
+        <w:t>[10] C. D. Manning, P. Raghavan, and H. Schütze, Introduction to Information Retrieval, Cambridge, UK: Cambridge University Press, 2008.</w:t>
       </w:r>
     </w:p>
     <w:p>
       <w:pPr>
-        <w:spacing w:after="120" w:line="360" w:lineRule="auto"/>
-      </w:pPr>
-      <w:r>
-        <w:rPr>
-          <w:rFonts w:ascii="Times New Roman" w:hAnsi="Times New Roman"/>
-          <w:sz w:val="24"/>
-          <w:szCs w:val="24"/>
-        </w:rPr>
-        <w:t xml:space="preserve">[5]  </w:t>
-      </w:r>
+        <w:spacing w:after="120"/>
+      </w:pPr>
     </w:p>
     <w:p>
       <w:pPr>

</xml_diff>